<commit_message>
checkpoint before checking out main
</commit_message>
<xml_diff>
--- a/docs/clients/group-order/Group2_Esperia_Energy/contracts/v6/CLIENT-PACKAGE/lighthief-response-v6.5/01-EPC-Agreement-Galascope-G1-G2-v6.5_L01 (Lighthief counter-redline).docx
+++ b/docs/clients/group-order/Group2_Esperia_Energy/contracts/v6/CLIENT-PACKAGE/lighthief-response-v6.5/01-EPC-Agreement-Galascope-G1-G2-v6.5_L01 (Lighthief counter-redline).docx
@@ -264,6 +264,15 @@
       </w:r>
     </w:p>
     <w:p>
+      <w:pPr/>
+      <w:r>
+        <w:rPr>
+          <w:color w:val="C06000"/>
+        </w:rPr>
+        <w:t>L01 addendum — 22 Sep 2026: Added Schedule A PART 7 (Client-Paid Exclusions) to close the Section 4.6 default-inclusion gap for licensed electrical drawings (EUR 5,000-15,000/site), EAC/DSO fees, third-party protection testing (~EUR 1,250/container) and CERA fees. These items were discussed and agreed with Dino in May 2026 (see meeting-dino-terms-may2026.md) but had not yet been formally documented in Schedule A; this closes that gap. Confirmed the Section 4.6B external-LPS inclusion for Galascope 1 &amp; 2 remains the sole exception to the client-paid default.</w:t>
+      </w:r>
+    </w:p>
+    <w:p>
       <w:r>
         <w:br w:type="page"/>
       </w:r>
@@ -5986,6 +5995,142 @@
     <w:p>
       <w:r>
         <w:t xml:space="preserve">6. Confirmed Price Certificate (issued within 14 days of Connection Terms receipt)</w:t>
+      </w:r>
+    </w:p>
+    <w:p>
+      <w:r>
+        <w:rPr>
+          <w:color w:val="C06000"/>
+        </w:rPr>
+      </w:r>
+    </w:p>
+    <w:p>
+      <w:r>
+        <w:rPr>
+          <w:color w:val="C06000"/>
+        </w:rPr>
+        <w:t>============================================================</w:t>
+      </w:r>
+    </w:p>
+    <w:p>
+      <w:r>
+        <w:rPr>
+          <w:color w:val="C06000"/>
+        </w:rPr>
+        <w:t>PART 7 — CLIENT-PAID EXCLUSIONS (per Section 4.6, fixed technical boundary and price impact)</w:t>
+      </w:r>
+    </w:p>
+    <w:p>
+      <w:r>
+        <w:rPr>
+          <w:color w:val="C06000"/>
+        </w:rPr>
+        <w:t>============================================================</w:t>
+      </w:r>
+    </w:p>
+    <w:p>
+      <w:r>
+        <w:rPr>
+          <w:color w:val="C06000"/>
+        </w:rPr>
+      </w:r>
+    </w:p>
+    <w:p>
+      <w:r>
+        <w:rPr>
+          <w:color w:val="C06000"/>
+        </w:rPr>
+        <w:t>The following items are expressly excluded from the Contract Price under Section 4.6 and are the Client's (or the Client's engineer's) responsibility. This block closes the Section 4.6 default-inclusion rule for these items — they are not part of the Contractor's turnkey scope.</w:t>
+      </w:r>
+    </w:p>
+    <w:p>
+      <w:r>
+        <w:rPr>
+          <w:color w:val="C06000"/>
+        </w:rPr>
+      </w:r>
+    </w:p>
+    <w:p>
+      <w:r>
+        <w:rPr>
+          <w:color w:val="C06000"/>
+        </w:rPr>
+        <w:t>1. Licensed electrical design and as-built drawings. Licensed-engineer permit single-line diagrams (SLDs) and formal as-built drawing packages for the wider Site (beyond the BESS compound), required for EAC/building-permit submission. This is separate from and in addition to the Contractor's ETEK installer sign-off (Costas Hadjikyriacou), which remains included in the Contract Price. Budget: EUR 5,000-15,000 per site, payable by the Client to the Client's licensed engineer.</w:t>
+      </w:r>
+    </w:p>
+    <w:p>
+      <w:r>
+        <w:rPr>
+          <w:color w:val="C06000"/>
+        </w:rPr>
+      </w:r>
+    </w:p>
+    <w:p>
+      <w:r>
+        <w:rPr>
+          <w:color w:val="C06000"/>
+        </w:rPr>
+        <w:t>2. EAC/DSO fees. Capital connection charges, inspection invoices and any other fees levied directly by the EAC/DSO, payable by the Client directly to the EAC/DSO. The Contractor coordinates and attends the DSO witness test (included in the Contract Price); any invoice the EAC issues for that inspection is the Client's responsibility.</w:t>
+      </w:r>
+    </w:p>
+    <w:p>
+      <w:r>
+        <w:rPr>
+          <w:color w:val="C06000"/>
+        </w:rPr>
+      </w:r>
+    </w:p>
+    <w:p>
+      <w:r>
+        <w:rPr>
+          <w:color w:val="C06000"/>
+        </w:rPr>
+        <w:t>3. Third-party protection testing fees. Where the EAC/DSO requires a separate, independent test contractor or certificate for protection-relay testing (beyond the Contractor's own commissioning tests), this is payable by the Client. Budget: approximately EUR 1,250 per container.</w:t>
+      </w:r>
+    </w:p>
+    <w:p>
+      <w:r>
+        <w:rPr>
+          <w:color w:val="C06000"/>
+        </w:rPr>
+      </w:r>
+    </w:p>
+    <w:p>
+      <w:r>
+        <w:rPr>
+          <w:color w:val="C06000"/>
+        </w:rPr>
+        <w:t>4. CERA fees. Any fees levied by the Cyprus Energy Regulatory Authority (CERA) in connection with the Project are the Client's responsibility.</w:t>
+      </w:r>
+    </w:p>
+    <w:p>
+      <w:r>
+        <w:rPr>
+          <w:color w:val="C06000"/>
+        </w:rPr>
+      </w:r>
+    </w:p>
+    <w:p>
+      <w:r>
+        <w:rPr>
+          <w:color w:val="C06000"/>
+        </w:rPr>
+        <w:t>5. Cable trenches and site levelling (Galascope 1 &amp; 2 only). Cable trench excavation, backfill and site levelling outside the BESS compound footprint are the Client's scope; the Contractor's scope is limited to the concrete equipment bases (D. Kouklis Constructions).</w:t>
+      </w:r>
+    </w:p>
+    <w:p>
+      <w:r>
+        <w:rPr>
+          <w:color w:val="C06000"/>
+        </w:rPr>
+      </w:r>
+    </w:p>
+    <w:p>
+      <w:r>
+        <w:rPr>
+          <w:color w:val="C06000"/>
+        </w:rPr>
+        <w:t>For the avoidance of doubt, external lightning protection (LPS) is NOT included in this exclusion list for Galascope 1 &amp; 2 — per Section 4.6B, external/site-level LPS is included in the Contract Price for these two Parks (an exception to the Contractor's general practice of treating external LPS as client-paid on other projects).</w:t>
       </w:r>
     </w:p>
     <w:p>

</xml_diff>